<commit_message>
Refactor hackathon plan and participant guides to enhance Playwright integration and testing focus
- Updated hackathon plan to include Playwright testing objectives and structured agenda.
- Revised Phase 1 participant guide to emphasize minimal app development for Playwright readiness.
- Adjusted Phase 2 participant guide to prioritize Playwright setup and testing scenarios.
- Enhanced Phase 3 participant guide to focus on deepening Playwright coverage and debugging.
- Created SKILL.md for Copilot to assist with Playwright testing strategies and best practices.
</commit_message>
<xml_diff>
--- a/hackathon-plan.docx
+++ b/hackathon-plan.docx
@@ -16,12 +16,12 @@
         <w:pStyle w:val="Heading1"/>
       </w:pPr>
       <w:r>
-        <w:t>Objective</w:t>
+        <w:t>🎯 Objective</w:t>
       </w:r>
     </w:p>
     <w:p>
       <w:r>
-        <w:t>Experience how GitHub Copilot can accelerate modern software development by building a simple, end-to-end application within a few hours.</w:t>
+        <w:t>Experience how GitHub Copilot can accelerate modern software development by building a simple, end-to-end application and using Playwright to validate it within a few hours.</w:t>
       </w:r>
     </w:p>
     <w:p>
@@ -55,6 +55,14 @@
     </w:p>
     <w:p>
       <w:pPr>
+        <w:pStyle w:val="ListBullet"/>
+      </w:pPr>
+      <w:r>
+        <w:t>Generate, refine, and troubleshoot meaningful Playwright end-to-end tests</w:t>
+      </w:r>
+    </w:p>
+    <w:p>
+      <w:pPr>
         <w:pStyle w:val="Heading2"/>
       </w:pPr>
       <w:r>
@@ -63,13 +71,13 @@
     </w:p>
     <w:p>
       <w:r>
-        <w:rPr>
-          <w:i/>
-        </w:rPr>
-        <w:t>Build an app that validates documents such as HR forms, invoices, certificates, or ID documents.</w:t>
+        <w:t>*Build an app that validates documents such as HR forms, invoices, certificates, or ID documents.*</w:t>
       </w:r>
     </w:p>
     <w:p>
+      <w:pPr>
+        <w:pStyle w:val="IntenseQuote"/>
+      </w:pPr>
       <w:r>
         <w:t>The goal is not to build a production-ready system, but to demonstrate how AI-assisted development can significantly reduce effort, improve productivity, and enable faster innovation.</w:t>
       </w:r>
@@ -79,7 +87,13 @@
         <w:pStyle w:val="Heading1"/>
       </w:pPr>
       <w:r>
-        <w:t>Participants</w:t>
+        <w:rPr>
+          <w:rFonts w:ascii="Segoe UI Emoji" w:hAnsi="Segoe UI Emoji" w:cs="Segoe UI Emoji"/>
+        </w:rPr>
+        <w:t>👥</w:t>
+      </w:r>
+      <w:r>
+        <w:t xml:space="preserve"> Participants</w:t>
       </w:r>
     </w:p>
     <w:p>
@@ -95,7 +109,7 @@
         <w:pStyle w:val="ListBullet"/>
       </w:pPr>
       <w:r>
-        <w:t>Optional: work in a GitHub repository to collect artifacts after the event</w:t>
+        <w:t>Optional: work in a **GitHub repository** to collect artifacts after the event</w:t>
       </w:r>
     </w:p>
     <w:p>
@@ -103,12 +117,18 @@
         <w:pStyle w:val="Heading1"/>
       </w:pPr>
       <w:r>
-        <w:t>Pre-Requisites (Send 3+ Days Before)</w:t>
+        <w:rPr>
+          <w:rFonts w:ascii="Segoe UI Emoji" w:hAnsi="Segoe UI Emoji" w:cs="Segoe UI Emoji"/>
+        </w:rPr>
+        <w:t>📋</w:t>
+      </w:r>
+      <w:r>
+        <w:t xml:space="preserve"> Pre-Requisites (Send 3+ Days Before)</w:t>
       </w:r>
     </w:p>
     <w:p>
       <w:r>
-        <w:t>Participants must have the following ready before the hackathon day:</w:t>
+        <w:t>Participants must have the following ready **before** the hackathon day:</w:t>
       </w:r>
     </w:p>
     <w:p>
@@ -116,7 +136,19 @@
         <w:pStyle w:val="ListBullet"/>
       </w:pPr>
       <w:r>
-        <w:t>VS Code installed</w:t>
+        <w:t xml:space="preserve">[ ] </w:t>
+      </w:r>
+      <w:r>
+        <w:t xml:space="preserve">IDE that supports GitHub Coplot </w:t>
+      </w:r>
+      <w:r>
+        <w:t>[VS Code</w:t>
+      </w:r>
+      <w:r>
+        <w:t xml:space="preserve"> recommended] </w:t>
+      </w:r>
+      <w:r>
+        <w:t>installed</w:t>
       </w:r>
     </w:p>
     <w:p>
@@ -124,7 +156,7 @@
         <w:pStyle w:val="ListBullet"/>
       </w:pPr>
       <w:r>
-        <w:t>GitHub Copilot extension installed and licensed</w:t>
+        <w:t>[ ] [GitHub Copilot extension](https://marketplace.visualstudio.com/items?itemName=GitHub.copilot) installed and licensed</w:t>
       </w:r>
     </w:p>
     <w:p>
@@ -132,7 +164,7 @@
         <w:pStyle w:val="ListBullet"/>
       </w:pPr>
       <w:r>
-        <w:t>Git installed</w:t>
+        <w:t>[ ] Git installed</w:t>
       </w:r>
     </w:p>
     <w:p>
@@ -140,7 +172,7 @@
         <w:pStyle w:val="ListBullet"/>
       </w:pPr>
       <w:r>
-        <w:t>Runtime of choice installed (Node.js 20+, Python 3.11+, Java 17+, or .NET 8+)</w:t>
+        <w:t>[ ] Runtime of choice installed (Node.js 20+, Python 3.11+, or .NET 8+)</w:t>
       </w:r>
     </w:p>
     <w:p>
@@ -148,7 +180,7 @@
         <w:pStyle w:val="ListBullet"/>
       </w:pPr>
       <w:r>
-        <w:t>Familiarity with at least one web framework</w:t>
+        <w:t>[ ] Familiarity with at least one web framework</w:t>
       </w:r>
     </w:p>
     <w:p>
@@ -156,14 +188,19 @@
         <w:pStyle w:val="Heading1"/>
       </w:pPr>
       <w:r>
-        <w:t>Agenda</w:t>
+        <w:rPr>
+          <w:rFonts w:ascii="Segoe UI Emoji" w:hAnsi="Segoe UI Emoji" w:cs="Segoe UI Emoji"/>
+        </w:rPr>
+        <w:t>📅</w:t>
+      </w:r>
+      <w:r>
+        <w:t xml:space="preserve"> Agenda</w:t>
       </w:r>
     </w:p>
     <w:tbl>
       <w:tblPr>
-        <w:tblStyle w:val="LightGrid-Accent1"/>
+        <w:tblStyle w:val="TableGrid"/>
         <w:tblW w:w="0" w:type="auto"/>
-        <w:jc w:val="center"/>
         <w:tblLook w:val="04A0" w:firstRow="1" w:lastRow="0" w:firstColumn="1" w:lastColumn="0" w:noHBand="0" w:noVBand="1"/>
       </w:tblPr>
       <w:tblGrid>
@@ -171,13 +208,8 @@
         <w:gridCol w:w="4320"/>
       </w:tblGrid>
       <w:tr>
-        <w:trPr>
-          <w:cnfStyle w:val="100000000000" w:firstRow="1" w:lastRow="0" w:firstColumn="0" w:lastColumn="0" w:oddVBand="0" w:evenVBand="0" w:oddHBand="0" w:evenHBand="0" w:firstRowFirstColumn="0" w:firstRowLastColumn="0" w:lastRowFirstColumn="0" w:lastRowLastColumn="0"/>
-          <w:jc w:val="center"/>
-        </w:trPr>
         <w:tc>
           <w:tcPr>
-            <w:cnfStyle w:val="001000000000" w:firstRow="0" w:lastRow="0" w:firstColumn="1" w:lastColumn="0" w:oddVBand="0" w:evenVBand="0" w:oddHBand="0" w:evenHBand="0" w:firstRowFirstColumn="0" w:firstRowLastColumn="0" w:lastRowFirstColumn="0" w:lastRowLastColumn="0"/>
             <w:tcW w:w="4320" w:type="dxa"/>
           </w:tcPr>
           <w:p>
@@ -191,9 +223,6 @@
             <w:tcW w:w="4320" w:type="dxa"/>
           </w:tcPr>
           <w:p>
-            <w:pPr>
-              <w:cnfStyle w:val="100000000000" w:firstRow="1" w:lastRow="0" w:firstColumn="0" w:lastColumn="0" w:oddVBand="0" w:evenVBand="0" w:oddHBand="0" w:evenHBand="0" w:firstRowFirstColumn="0" w:firstRowLastColumn="0" w:lastRowFirstColumn="0" w:lastRowLastColumn="0"/>
-            </w:pPr>
             <w:r>
               <w:t>Duration</w:t>
             </w:r>
@@ -201,13 +230,8 @@
         </w:tc>
       </w:tr>
       <w:tr>
-        <w:trPr>
-          <w:cnfStyle w:val="000000100000" w:firstRow="0" w:lastRow="0" w:firstColumn="0" w:lastColumn="0" w:oddVBand="0" w:evenVBand="0" w:oddHBand="1" w:evenHBand="0" w:firstRowFirstColumn="0" w:firstRowLastColumn="0" w:lastRowFirstColumn="0" w:lastRowLastColumn="0"/>
-          <w:jc w:val="center"/>
-        </w:trPr>
         <w:tc>
           <w:tcPr>
-            <w:cnfStyle w:val="001000000000" w:firstRow="0" w:lastRow="0" w:firstColumn="1" w:lastColumn="0" w:oddVBand="0" w:evenVBand="0" w:oddHBand="0" w:evenHBand="0" w:firstRowFirstColumn="0" w:firstRowLastColumn="0" w:lastRowFirstColumn="0" w:lastRowLastColumn="0"/>
             <w:tcW w:w="4320" w:type="dxa"/>
           </w:tcPr>
           <w:p>
@@ -221,9 +245,6 @@
             <w:tcW w:w="4320" w:type="dxa"/>
           </w:tcPr>
           <w:p>
-            <w:pPr>
-              <w:cnfStyle w:val="000000100000" w:firstRow="0" w:lastRow="0" w:firstColumn="0" w:lastColumn="0" w:oddVBand="0" w:evenVBand="0" w:oddHBand="1" w:evenHBand="0" w:firstRowFirstColumn="0" w:firstRowLastColumn="0" w:lastRowFirstColumn="0" w:lastRowLastColumn="0"/>
-            </w:pPr>
             <w:r>
               <w:t>30 min</w:t>
             </w:r>
@@ -231,18 +252,13 @@
         </w:tc>
       </w:tr>
       <w:tr>
-        <w:trPr>
-          <w:cnfStyle w:val="000000010000" w:firstRow="0" w:lastRow="0" w:firstColumn="0" w:lastColumn="0" w:oddVBand="0" w:evenVBand="0" w:oddHBand="0" w:evenHBand="1" w:firstRowFirstColumn="0" w:firstRowLastColumn="0" w:lastRowFirstColumn="0" w:lastRowLastColumn="0"/>
-          <w:jc w:val="center"/>
-        </w:trPr>
         <w:tc>
           <w:tcPr>
-            <w:cnfStyle w:val="001000000000" w:firstRow="0" w:lastRow="0" w:firstColumn="1" w:lastColumn="0" w:oddVBand="0" w:evenVBand="0" w:oddHBand="0" w:evenHBand="0" w:firstRowFirstColumn="0" w:firstRowLastColumn="0" w:lastRowFirstColumn="0" w:lastRowLastColumn="0"/>
             <w:tcW w:w="4320" w:type="dxa"/>
           </w:tcPr>
           <w:p>
             <w:r>
-              <w:t>Build Phase 1 — Core</w:t>
+              <w:t>Build Phase 1 — Core App</w:t>
             </w:r>
           </w:p>
         </w:tc>
@@ -251,28 +267,20 @@
             <w:tcW w:w="4320" w:type="dxa"/>
           </w:tcPr>
           <w:p>
-            <w:pPr>
-              <w:cnfStyle w:val="000000010000" w:firstRow="0" w:lastRow="0" w:firstColumn="0" w:lastColumn="0" w:oddVBand="0" w:evenVBand="0" w:oddHBand="0" w:evenHBand="1" w:firstRowFirstColumn="0" w:firstRowLastColumn="0" w:lastRowFirstColumn="0" w:lastRowLastColumn="0"/>
-            </w:pPr>
             <w:r>
-              <w:t>2 hours</w:t>
+              <w:t>1.5 hours</w:t>
             </w:r>
           </w:p>
         </w:tc>
       </w:tr>
       <w:tr>
-        <w:trPr>
-          <w:cnfStyle w:val="000000100000" w:firstRow="0" w:lastRow="0" w:firstColumn="0" w:lastColumn="0" w:oddVBand="0" w:evenVBand="0" w:oddHBand="1" w:evenHBand="0" w:firstRowFirstColumn="0" w:firstRowLastColumn="0" w:lastRowFirstColumn="0" w:lastRowLastColumn="0"/>
-          <w:jc w:val="center"/>
-        </w:trPr>
         <w:tc>
           <w:tcPr>
-            <w:cnfStyle w:val="001000000000" w:firstRow="0" w:lastRow="0" w:firstColumn="1" w:lastColumn="0" w:oddVBand="0" w:evenVBand="0" w:oddHBand="0" w:evenHBand="0" w:firstRowFirstColumn="0" w:firstRowLastColumn="0" w:lastRowFirstColumn="0" w:lastRowLastColumn="0"/>
             <w:tcW w:w="4320" w:type="dxa"/>
           </w:tcPr>
           <w:p>
             <w:r>
-              <w:t>Build Phase 2 — Enhance</w:t>
+              <w:t>Build Phase 2 — Playwright Foundations</w:t>
             </w:r>
           </w:p>
         </w:tc>
@@ -281,9 +289,6 @@
             <w:tcW w:w="4320" w:type="dxa"/>
           </w:tcPr>
           <w:p>
-            <w:pPr>
-              <w:cnfStyle w:val="000000100000" w:firstRow="0" w:lastRow="0" w:firstColumn="0" w:lastColumn="0" w:oddVBand="0" w:evenVBand="0" w:oddHBand="1" w:evenHBand="0" w:firstRowFirstColumn="0" w:firstRowLastColumn="0" w:lastRowFirstColumn="0" w:lastRowLastColumn="0"/>
-            </w:pPr>
             <w:r>
               <w:t>1.5 hours</w:t>
             </w:r>
@@ -291,18 +296,13 @@
         </w:tc>
       </w:tr>
       <w:tr>
-        <w:trPr>
-          <w:cnfStyle w:val="000000010000" w:firstRow="0" w:lastRow="0" w:firstColumn="0" w:lastColumn="0" w:oddVBand="0" w:evenVBand="0" w:oddHBand="0" w:evenHBand="1" w:firstRowFirstColumn="0" w:firstRowLastColumn="0" w:lastRowFirstColumn="0" w:lastRowLastColumn="0"/>
-          <w:jc w:val="center"/>
-        </w:trPr>
         <w:tc>
           <w:tcPr>
-            <w:cnfStyle w:val="001000000000" w:firstRow="0" w:lastRow="0" w:firstColumn="1" w:lastColumn="0" w:oddVBand="0" w:evenVBand="0" w:oddHBand="0" w:evenHBand="0" w:firstRowFirstColumn="0" w:firstRowLastColumn="0" w:lastRowFirstColumn="0" w:lastRowLastColumn="0"/>
             <w:tcW w:w="4320" w:type="dxa"/>
           </w:tcPr>
           <w:p>
             <w:r>
-              <w:t>Build Phase 3 — Stretch</w:t>
+              <w:t>Build Phase 3 — Playwright Deepening</w:t>
             </w:r>
           </w:p>
         </w:tc>
@@ -311,27 +311,20 @@
             <w:tcW w:w="4320" w:type="dxa"/>
           </w:tcPr>
           <w:p>
-            <w:pPr>
-              <w:cnfStyle w:val="000000010000" w:firstRow="0" w:lastRow="0" w:firstColumn="0" w:lastColumn="0" w:oddVBand="0" w:evenVBand="0" w:oddHBand="0" w:evenHBand="1" w:firstRowFirstColumn="0" w:firstRowLastColumn="0" w:lastRowFirstColumn="0" w:lastRowLastColumn="0"/>
-            </w:pPr>
             <w:r>
-              <w:t>1 hour</w:t>
+              <w:t>1.5 hours</w:t>
             </w:r>
           </w:p>
         </w:tc>
       </w:tr>
       <w:tr>
-        <w:trPr>
-          <w:cnfStyle w:val="000000100000" w:firstRow="0" w:lastRow="0" w:firstColumn="0" w:lastColumn="0" w:oddVBand="0" w:evenVBand="0" w:oddHBand="1" w:evenHBand="0" w:firstRowFirstColumn="0" w:firstRowLastColumn="0" w:lastRowFirstColumn="0" w:lastRowLastColumn="0"/>
-          <w:jc w:val="center"/>
-        </w:trPr>
         <w:tc>
           <w:tcPr>
-            <w:cnfStyle w:val="001000000000" w:firstRow="0" w:lastRow="0" w:firstColumn="1" w:lastColumn="0" w:oddVBand="0" w:evenVBand="0" w:oddHBand="0" w:evenHBand="0" w:firstRowFirstColumn="0" w:firstRowLastColumn="0" w:lastRowFirstColumn="0" w:lastRowLastColumn="0"/>
             <w:tcW w:w="4320" w:type="dxa"/>
           </w:tcPr>
           <w:p>
             <w:r>
+              <w:lastRenderedPageBreak/>
               <w:t>Demos &amp; Wrap-Up</w:t>
             </w:r>
           </w:p>
@@ -341,9 +334,6 @@
             <w:tcW w:w="4320" w:type="dxa"/>
           </w:tcPr>
           <w:p>
-            <w:pPr>
-              <w:cnfStyle w:val="000000100000" w:firstRow="0" w:lastRow="0" w:firstColumn="0" w:lastColumn="0" w:oddVBand="0" w:evenVBand="0" w:oddHBand="1" w:evenHBand="0" w:firstRowFirstColumn="0" w:firstRowLastColumn="0" w:lastRowFirstColumn="0" w:lastRowLastColumn="0"/>
-            </w:pPr>
             <w:r>
               <w:t>1 hour</w:t>
             </w:r>
@@ -373,14 +363,6 @@
         <w:pStyle w:val="ListBullet"/>
       </w:pPr>
       <w:r>
-        <w:t>Live demo: Build a small feature with Copilot in 5 minutes (shows agent mode, inline completions, chat)</w:t>
-      </w:r>
-    </w:p>
-    <w:p>
-      <w:pPr>
-        <w:pStyle w:val="ListBullet"/>
-      </w:pPr>
-      <w:r>
         <w:t>Overview of the challenge and example use cases</w:t>
       </w:r>
     </w:p>
@@ -397,18 +379,12 @@
         <w:pStyle w:val="Heading2"/>
       </w:pPr>
       <w:r>
-        <w:t>Build Phase 1 — Core Flow (2 hours)</w:t>
+        <w:t>Build Phase 1 — Core App (1.5 hours)</w:t>
       </w:r>
     </w:p>
     <w:p>
       <w:r>
-        <w:t xml:space="preserve">Goal: </w:t>
-      </w:r>
-      <w:r>
-        <w:rPr>
-          <w:b/>
-        </w:rPr>
-        <w:t>Achieve a working end-to-end flow.</w:t>
+        <w:t>Goal: **Achieve a working end-to-end flow.**</w:t>
       </w:r>
     </w:p>
     <w:p>
@@ -444,14 +420,17 @@
       </w:r>
     </w:p>
     <w:p>
+      <w:pPr>
+        <w:pStyle w:val="IntenseQuote"/>
+      </w:pPr>
       <w:r>
         <w:rPr>
-          <w:b/>
+          <w:rFonts w:ascii="Segoe UI Emoji" w:hAnsi="Segoe UI Emoji" w:cs="Segoe UI Emoji"/>
         </w:rPr>
-        <w:t xml:space="preserve">Tip: </w:t>
+        <w:t>💡</w:t>
       </w:r>
       <w:r>
-        <w:t>Use a starter template (see below) to skip boilerplate and jump straight to the interesting parts.</w:t>
+        <w:t xml:space="preserve"> **Tip:** Use a starter template (see below) to skip boilerplate and jump straight to the interesting parts.</w:t>
       </w:r>
     </w:p>
     <w:p>
@@ -459,18 +438,58 @@
         <w:pStyle w:val="Heading2"/>
       </w:pPr>
       <w:r>
-        <w:t>Build Phase 2 — Enhance (1.5 hours)</w:t>
+        <w:t>Build Phase 2 — Playwright Foundations (1.5 hours)</w:t>
+      </w:r>
+    </w:p>
+    <w:p/>
+    <w:p>
+      <w:r>
+        <w:t>Goal: **Create the first meaningful Playwright coverage for the app.**</w:t>
+      </w:r>
+    </w:p>
+    <w:p>
+      <w:pPr>
+        <w:pStyle w:val="ListBullet"/>
+      </w:pPr>
+      <w:r>
+        <w:t>Install and configure Playwright</w:t>
+      </w:r>
+    </w:p>
+    <w:p>
+      <w:pPr>
+        <w:pStyle w:val="ListBullet"/>
+      </w:pPr>
+      <w:r>
+        <w:t>Create the first end-to-end spec with Copilot</w:t>
+      </w:r>
+    </w:p>
+    <w:p>
+      <w:pPr>
+        <w:pStyle w:val="ListBullet"/>
+      </w:pPr>
+      <w:r>
+        <w:t>Automate the happy path for the chosen document-validation scenario</w:t>
+      </w:r>
+    </w:p>
+    <w:p>
+      <w:pPr>
+        <w:pStyle w:val="ListBullet"/>
+      </w:pPr>
+      <w:r>
+        <w:t>Run tests locally and interpret failures with Copilot</w:t>
+      </w:r>
+    </w:p>
+    <w:p>
+      <w:pPr>
+        <w:pStyle w:val="Heading2"/>
+      </w:pPr>
+      <w:r>
+        <w:t>Build Phase 3 — Playwright Deepening (1.5 hours)</w:t>
       </w:r>
     </w:p>
     <w:p>
       <w:r>
-        <w:t xml:space="preserve">Goal: </w:t>
-      </w:r>
-      <w:r>
-        <w:rPr>
-          <w:b/>
-        </w:rPr>
-        <w:t>Add business value and polish.</w:t>
+        <w:t>Goal: **Deepen coverage and improve test quality.**</w:t>
       </w:r>
     </w:p>
     <w:p>
@@ -478,7 +497,7 @@
         <w:pStyle w:val="ListBullet"/>
       </w:pPr>
       <w:r>
-        <w:t>Add validation rules or business logic (required fields, date checks, format validation)</w:t>
+        <w:t>Add at least one negative-path validation test</w:t>
       </w:r>
     </w:p>
     <w:p>
@@ -486,7 +505,7 @@
         <w:pStyle w:val="ListBullet"/>
       </w:pPr>
       <w:r>
-        <w:t>Enhance results display (clear pass/fail indicators, detailed feedback, insights)</w:t>
+        <w:t>Add one richer scenario such as file upload, multi-document flow, retry/error handling, or mocked backend behavior</w:t>
       </w:r>
     </w:p>
     <w:p>
@@ -494,101 +513,23 @@
         <w:pStyle w:val="ListBullet"/>
       </w:pPr>
       <w:r>
-        <w:t>Improve user experience (error handling, loading states, styling)</w:t>
+        <w:t>Improve selectors and assertions using accessible locators such as `getByRole` and `getByLabel`</w:t>
       </w:r>
     </w:p>
     <w:p>
       <w:pPr>
-        <w:pStyle w:val="Heading2"/>
+        <w:pStyle w:val="ListBullet"/>
       </w:pPr>
       <w:r>
-        <w:t>Build Phase 3 — Stretch (1 hour)</w:t>
+        <w:t>Use trace or screenshot output to debug a failed test with Copilot</w:t>
       </w:r>
     </w:p>
+    <w:p/>
     <w:p>
+      <w:pPr>
+        <w:pStyle w:val="Heading2"/>
+      </w:pPr>
       <w:r>
-        <w:t xml:space="preserve">Goal: </w:t>
-      </w:r>
-      <w:r>
-        <w:rPr>
-          <w:b/>
-        </w:rPr>
-        <w:t>Go beyond the basics.</w:t>
-      </w:r>
-      <w:r>
-        <w:t xml:space="preserve"> For teams that have a solid working app.</w:t>
-      </w:r>
-    </w:p>
-    <w:p>
-      <w:pPr>
-        <w:pStyle w:val="ListBullet"/>
-      </w:pPr>
-      <w:r>
-        <w:t>Add unit tests using Copilot-generated test suggestions</w:t>
-      </w:r>
-    </w:p>
-    <w:p>
-      <w:pPr>
-        <w:pStyle w:val="ListBullet"/>
-      </w:pPr>
-      <w:r>
-        <w:t>Support multiple document types — add a second validation scenario (e.g., invoices + HR forms) with different rules</w:t>
-      </w:r>
-    </w:p>
-    <w:p>
-      <w:pPr>
-        <w:pStyle w:val="ListBullet"/>
-      </w:pPr>
-      <w:r>
-        <w:t>Accept PDF uploads — extract text from uploaded files instead of form input</w:t>
-      </w:r>
-    </w:p>
-    <w:p>
-      <w:pPr>
-        <w:pStyle w:val="ListBullet"/>
-      </w:pPr>
-      <w:r>
-        <w:t>Build a summary dashboard showing all validation results</w:t>
-      </w:r>
-    </w:p>
-    <w:p>
-      <w:pPr>
-        <w:pStyle w:val="ListBullet"/>
-      </w:pPr>
-      <w:r>
-        <w:t>Add data persistence (save and retrieve past validations)</w:t>
-      </w:r>
-    </w:p>
-    <w:p>
-      <w:pPr>
-        <w:pStyle w:val="ListBullet"/>
-      </w:pPr>
-      <w:r>
-        <w:t>Create a reusable Copilot SKILL file — write a .md skill that captures your validation rules, patterns, or domain knowledge so Copilot can use it in future projects</w:t>
-      </w:r>
-    </w:p>
-    <w:p>
-      <w:pPr>
-        <w:pStyle w:val="ListBullet"/>
-      </w:pPr>
-      <w:r>
-        <w:t>Add custom instructions (.github/copilot-instructions.md) — define project-level rules Copilot follows automatically, e.g., consistent error response format or validation patterns</w:t>
-      </w:r>
-    </w:p>
-    <w:p>
-      <w:pPr>
-        <w:pStyle w:val="ListBullet"/>
-      </w:pPr>
-      <w:r>
-        <w:t>Build a custom agent (.agent.md) — define a specialized agent with specific instructions, e.g., a “validation expert” that knows your document schema and suggests validation patterns</w:t>
-      </w:r>
-    </w:p>
-    <w:p>
-      <w:pPr>
-        <w:pStyle w:val="Heading2"/>
-      </w:pPr>
-      <w:r>
-        <w:lastRenderedPageBreak/>
         <w:t>Demos &amp; Wrap-Up (1 hour)</w:t>
       </w:r>
     </w:p>
@@ -621,19 +562,25 @@
         <w:pStyle w:val="Heading1"/>
       </w:pPr>
       <w:r>
-        <w:t>Example Use Cases</w:t>
+        <w:rPr>
+          <w:rFonts w:ascii="Segoe UI Emoji" w:hAnsi="Segoe UI Emoji" w:cs="Segoe UI Emoji"/>
+        </w:rPr>
+        <w:lastRenderedPageBreak/>
+        <w:t>💡</w:t>
+      </w:r>
+      <w:r>
+        <w:t xml:space="preserve"> Example Use Cases</w:t>
       </w:r>
     </w:p>
     <w:p>
       <w:r>
-        <w:t>Pick one to keep scope manageable:</w:t>
+        <w:t>Pick **one** to keep scope manageable:</w:t>
       </w:r>
     </w:p>
     <w:tbl>
       <w:tblPr>
-        <w:tblStyle w:val="LightGrid-Accent1"/>
+        <w:tblStyle w:val="TableGrid"/>
         <w:tblW w:w="0" w:type="auto"/>
-        <w:jc w:val="center"/>
         <w:tblLook w:val="04A0" w:firstRow="1" w:lastRow="0" w:firstColumn="1" w:lastColumn="0" w:noHBand="0" w:noVBand="1"/>
       </w:tblPr>
       <w:tblGrid>
@@ -641,13 +588,8 @@
         <w:gridCol w:w="4320"/>
       </w:tblGrid>
       <w:tr>
-        <w:trPr>
-          <w:cnfStyle w:val="100000000000" w:firstRow="1" w:lastRow="0" w:firstColumn="0" w:lastColumn="0" w:oddVBand="0" w:evenVBand="0" w:oddHBand="0" w:evenHBand="0" w:firstRowFirstColumn="0" w:firstRowLastColumn="0" w:lastRowFirstColumn="0" w:lastRowLastColumn="0"/>
-          <w:jc w:val="center"/>
-        </w:trPr>
         <w:tc>
           <w:tcPr>
-            <w:cnfStyle w:val="001000000000" w:firstRow="0" w:lastRow="0" w:firstColumn="1" w:lastColumn="0" w:oddVBand="0" w:evenVBand="0" w:oddHBand="0" w:evenHBand="0" w:firstRowFirstColumn="0" w:firstRowLastColumn="0" w:lastRowFirstColumn="0" w:lastRowLastColumn="0"/>
             <w:tcW w:w="4320" w:type="dxa"/>
           </w:tcPr>
           <w:p>
@@ -661,9 +603,6 @@
             <w:tcW w:w="4320" w:type="dxa"/>
           </w:tcPr>
           <w:p>
-            <w:pPr>
-              <w:cnfStyle w:val="100000000000" w:firstRow="1" w:lastRow="0" w:firstColumn="0" w:lastColumn="0" w:oddVBand="0" w:evenVBand="0" w:oddHBand="0" w:evenHBand="0" w:firstRowFirstColumn="0" w:firstRowLastColumn="0" w:lastRowFirstColumn="0" w:lastRowLastColumn="0"/>
-            </w:pPr>
             <w:r>
               <w:t>What It Validates</w:t>
             </w:r>
@@ -671,18 +610,13 @@
         </w:tc>
       </w:tr>
       <w:tr>
-        <w:trPr>
-          <w:cnfStyle w:val="000000100000" w:firstRow="0" w:lastRow="0" w:firstColumn="0" w:lastColumn="0" w:oddVBand="0" w:evenVBand="0" w:oddHBand="1" w:evenHBand="0" w:firstRowFirstColumn="0" w:firstRowLastColumn="0" w:lastRowFirstColumn="0" w:lastRowLastColumn="0"/>
-          <w:jc w:val="center"/>
-        </w:trPr>
         <w:tc>
           <w:tcPr>
-            <w:cnfStyle w:val="001000000000" w:firstRow="0" w:lastRow="0" w:firstColumn="1" w:lastColumn="0" w:oddVBand="0" w:evenVBand="0" w:oddHBand="0" w:evenHBand="0" w:firstRowFirstColumn="0" w:firstRowLastColumn="0" w:lastRowFirstColumn="0" w:lastRowLastColumn="0"/>
             <w:tcW w:w="4320" w:type="dxa"/>
           </w:tcPr>
           <w:p>
             <w:r>
-              <w:t>Invoice Checker</w:t>
+              <w:t>**Invoice Checker**</w:t>
             </w:r>
           </w:p>
         </w:tc>
@@ -691,9 +625,6 @@
             <w:tcW w:w="4320" w:type="dxa"/>
           </w:tcPr>
           <w:p>
-            <w:pPr>
-              <w:cnfStyle w:val="000000100000" w:firstRow="0" w:lastRow="0" w:firstColumn="0" w:lastColumn="0" w:oddVBand="0" w:evenVBand="0" w:oddHBand="1" w:evenHBand="0" w:firstRowFirstColumn="0" w:firstRowLastColumn="0" w:lastRowFirstColumn="0" w:lastRowLastColumn="0"/>
-            </w:pPr>
             <w:r>
               <w:t>Required fields present (vendor, amount, date, PO number), amounts are positive, date is not in the future</w:t>
             </w:r>
@@ -701,18 +632,13 @@
         </w:tc>
       </w:tr>
       <w:tr>
-        <w:trPr>
-          <w:cnfStyle w:val="000000010000" w:firstRow="0" w:lastRow="0" w:firstColumn="0" w:lastColumn="0" w:oddVBand="0" w:evenVBand="0" w:oddHBand="0" w:evenHBand="1" w:firstRowFirstColumn="0" w:firstRowLastColumn="0" w:lastRowFirstColumn="0" w:lastRowLastColumn="0"/>
-          <w:jc w:val="center"/>
-        </w:trPr>
         <w:tc>
           <w:tcPr>
-            <w:cnfStyle w:val="001000000000" w:firstRow="0" w:lastRow="0" w:firstColumn="1" w:lastColumn="0" w:oddVBand="0" w:evenVBand="0" w:oddHBand="0" w:evenHBand="0" w:firstRowFirstColumn="0" w:firstRowLastColumn="0" w:lastRowFirstColumn="0" w:lastRowLastColumn="0"/>
             <w:tcW w:w="4320" w:type="dxa"/>
           </w:tcPr>
           <w:p>
             <w:r>
-              <w:t>HR Form Validator</w:t>
+              <w:t>**HR Form Validator**</w:t>
             </w:r>
           </w:p>
         </w:tc>
@@ -721,9 +647,6 @@
             <w:tcW w:w="4320" w:type="dxa"/>
           </w:tcPr>
           <w:p>
-            <w:pPr>
-              <w:cnfStyle w:val="000000010000" w:firstRow="0" w:lastRow="0" w:firstColumn="0" w:lastColumn="0" w:oddVBand="0" w:evenVBand="0" w:oddHBand="0" w:evenHBand="1" w:firstRowFirstColumn="0" w:firstRowLastColumn="0" w:lastRowFirstColumn="0" w:lastRowLastColumn="0"/>
-            </w:pPr>
             <w:r>
               <w:t>Employee name, ID, department filled in; signature present; dates are logical</w:t>
             </w:r>
@@ -731,18 +654,13 @@
         </w:tc>
       </w:tr>
       <w:tr>
-        <w:trPr>
-          <w:cnfStyle w:val="000000100000" w:firstRow="0" w:lastRow="0" w:firstColumn="0" w:lastColumn="0" w:oddVBand="0" w:evenVBand="0" w:oddHBand="1" w:evenHBand="0" w:firstRowFirstColumn="0" w:firstRowLastColumn="0" w:lastRowFirstColumn="0" w:lastRowLastColumn="0"/>
-          <w:jc w:val="center"/>
-        </w:trPr>
         <w:tc>
           <w:tcPr>
-            <w:cnfStyle w:val="001000000000" w:firstRow="0" w:lastRow="0" w:firstColumn="1" w:lastColumn="0" w:oddVBand="0" w:evenVBand="0" w:oddHBand="0" w:evenHBand="0" w:firstRowFirstColumn="0" w:firstRowLastColumn="0" w:lastRowFirstColumn="0" w:lastRowLastColumn="0"/>
             <w:tcW w:w="4320" w:type="dxa"/>
           </w:tcPr>
           <w:p>
             <w:r>
-              <w:t>ID Document Verifier</w:t>
+              <w:t>**ID Document Verifier**</w:t>
             </w:r>
           </w:p>
         </w:tc>
@@ -751,9 +669,6 @@
             <w:tcW w:w="4320" w:type="dxa"/>
           </w:tcPr>
           <w:p>
-            <w:pPr>
-              <w:cnfStyle w:val="000000100000" w:firstRow="0" w:lastRow="0" w:firstColumn="0" w:lastColumn="0" w:oddVBand="0" w:evenVBand="0" w:oddHBand="1" w:evenHBand="0" w:firstRowFirstColumn="0" w:firstRowLastColumn="0" w:lastRowFirstColumn="0" w:lastRowLastColumn="0"/>
-            </w:pPr>
             <w:r>
               <w:t>Expiry date check, required fields present, format consistency</w:t>
             </w:r>
@@ -761,18 +676,13 @@
         </w:tc>
       </w:tr>
       <w:tr>
-        <w:trPr>
-          <w:cnfStyle w:val="000000010000" w:firstRow="0" w:lastRow="0" w:firstColumn="0" w:lastColumn="0" w:oddVBand="0" w:evenVBand="0" w:oddHBand="0" w:evenHBand="1" w:firstRowFirstColumn="0" w:firstRowLastColumn="0" w:lastRowFirstColumn="0" w:lastRowLastColumn="0"/>
-          <w:jc w:val="center"/>
-        </w:trPr>
         <w:tc>
           <w:tcPr>
-            <w:cnfStyle w:val="001000000000" w:firstRow="0" w:lastRow="0" w:firstColumn="1" w:lastColumn="0" w:oddVBand="0" w:evenVBand="0" w:oddHBand="0" w:evenHBand="0" w:firstRowFirstColumn="0" w:firstRowLastColumn="0" w:lastRowFirstColumn="0" w:lastRowLastColumn="0"/>
             <w:tcW w:w="4320" w:type="dxa"/>
           </w:tcPr>
           <w:p>
             <w:r>
-              <w:t>Certificate Validator</w:t>
+              <w:t>**Certificate Validator**</w:t>
             </w:r>
           </w:p>
         </w:tc>
@@ -781,9 +691,6 @@
             <w:tcW w:w="4320" w:type="dxa"/>
           </w:tcPr>
           <w:p>
-            <w:pPr>
-              <w:cnfStyle w:val="000000010000" w:firstRow="0" w:lastRow="0" w:firstColumn="0" w:lastColumn="0" w:oddVBand="0" w:evenVBand="0" w:oddHBand="0" w:evenHBand="1" w:firstRowFirstColumn="0" w:firstRowLastColumn="0" w:lastRowFirstColumn="0" w:lastRowLastColumn="0"/>
-            </w:pPr>
             <w:r>
               <w:t>Issuer information present, valid date range, certificate number format</w:t>
             </w:r>
@@ -791,18 +698,13 @@
         </w:tc>
       </w:tr>
       <w:tr>
-        <w:trPr>
-          <w:cnfStyle w:val="000000100000" w:firstRow="0" w:lastRow="0" w:firstColumn="0" w:lastColumn="0" w:oddVBand="0" w:evenVBand="0" w:oddHBand="1" w:evenHBand="0" w:firstRowFirstColumn="0" w:firstRowLastColumn="0" w:lastRowFirstColumn="0" w:lastRowLastColumn="0"/>
-          <w:jc w:val="center"/>
-        </w:trPr>
         <w:tc>
           <w:tcPr>
-            <w:cnfStyle w:val="001000000000" w:firstRow="0" w:lastRow="0" w:firstColumn="1" w:lastColumn="0" w:oddVBand="0" w:evenVBand="0" w:oddHBand="0" w:evenHBand="0" w:firstRowFirstColumn="0" w:firstRowLastColumn="0" w:lastRowFirstColumn="0" w:lastRowLastColumn="0"/>
             <w:tcW w:w="4320" w:type="dxa"/>
           </w:tcPr>
           <w:p>
             <w:r>
-              <w:t>Expense Report Auditor</w:t>
+              <w:t>**Expense Report Auditor**</w:t>
             </w:r>
           </w:p>
         </w:tc>
@@ -811,9 +713,6 @@
             <w:tcW w:w="4320" w:type="dxa"/>
           </w:tcPr>
           <w:p>
-            <w:pPr>
-              <w:cnfStyle w:val="000000100000" w:firstRow="0" w:lastRow="0" w:firstColumn="0" w:lastColumn="0" w:oddVBand="0" w:evenVBand="0" w:oddHBand="1" w:evenHBand="0" w:firstRowFirstColumn="0" w:firstRowLastColumn="0" w:lastRowFirstColumn="0" w:lastRowLastColumn="0"/>
-            </w:pPr>
             <w:r>
               <w:t>Line items sum to total, receipts attached, within policy limits</w:t>
             </w:r>
@@ -826,19 +725,18 @@
         <w:pStyle w:val="Heading1"/>
       </w:pPr>
       <w:r>
-        <w:t>Recommended Starter Stacks</w:t>
+        <w:t>🏗️ Recommended Starter Stacks</w:t>
       </w:r>
     </w:p>
     <w:p>
       <w:r>
-        <w:t>Teams are free to choose their own, but here are four fast-start paths:</w:t>
+        <w:t>Teams are free to choose their own, but here are three fast-start paths:</w:t>
       </w:r>
     </w:p>
     <w:tbl>
       <w:tblPr>
-        <w:tblStyle w:val="LightGrid-Accent1"/>
+        <w:tblStyle w:val="TableGrid"/>
         <w:tblW w:w="0" w:type="auto"/>
-        <w:jc w:val="center"/>
         <w:tblLook w:val="04A0" w:firstRow="1" w:lastRow="0" w:firstColumn="1" w:lastColumn="0" w:noHBand="0" w:noVBand="1"/>
       </w:tblPr>
       <w:tblGrid>
@@ -848,13 +746,8 @@
         <w:gridCol w:w="2160"/>
       </w:tblGrid>
       <w:tr>
-        <w:trPr>
-          <w:cnfStyle w:val="100000000000" w:firstRow="1" w:lastRow="0" w:firstColumn="0" w:lastColumn="0" w:oddVBand="0" w:evenVBand="0" w:oddHBand="0" w:evenHBand="0" w:firstRowFirstColumn="0" w:firstRowLastColumn="0" w:lastRowFirstColumn="0" w:lastRowLastColumn="0"/>
-          <w:jc w:val="center"/>
-        </w:trPr>
         <w:tc>
           <w:tcPr>
-            <w:cnfStyle w:val="001000000000" w:firstRow="0" w:lastRow="0" w:firstColumn="1" w:lastColumn="0" w:oddVBand="0" w:evenVBand="0" w:oddHBand="0" w:evenHBand="0" w:firstRowFirstColumn="0" w:firstRowLastColumn="0" w:lastRowFirstColumn="0" w:lastRowLastColumn="0"/>
             <w:tcW w:w="2160" w:type="dxa"/>
           </w:tcPr>
           <w:p>
@@ -868,9 +761,6 @@
             <w:tcW w:w="2160" w:type="dxa"/>
           </w:tcPr>
           <w:p>
-            <w:pPr>
-              <w:cnfStyle w:val="100000000000" w:firstRow="1" w:lastRow="0" w:firstColumn="0" w:lastColumn="0" w:oddVBand="0" w:evenVBand="0" w:oddHBand="0" w:evenHBand="0" w:firstRowFirstColumn="0" w:firstRowLastColumn="0" w:lastRowFirstColumn="0" w:lastRowLastColumn="0"/>
-            </w:pPr>
             <w:r>
               <w:t>Frontend</w:t>
             </w:r>
@@ -881,9 +771,6 @@
             <w:tcW w:w="2160" w:type="dxa"/>
           </w:tcPr>
           <w:p>
-            <w:pPr>
-              <w:cnfStyle w:val="100000000000" w:firstRow="1" w:lastRow="0" w:firstColumn="0" w:lastColumn="0" w:oddVBand="0" w:evenVBand="0" w:oddHBand="0" w:evenHBand="0" w:firstRowFirstColumn="0" w:firstRowLastColumn="0" w:lastRowFirstColumn="0" w:lastRowLastColumn="0"/>
-            </w:pPr>
             <w:r>
               <w:t>Backend</w:t>
             </w:r>
@@ -894,9 +781,6 @@
             <w:tcW w:w="2160" w:type="dxa"/>
           </w:tcPr>
           <w:p>
-            <w:pPr>
-              <w:cnfStyle w:val="100000000000" w:firstRow="1" w:lastRow="0" w:firstColumn="0" w:lastColumn="0" w:oddVBand="0" w:evenVBand="0" w:oddHBand="0" w:evenHBand="0" w:firstRowFirstColumn="0" w:firstRowLastColumn="0" w:lastRowFirstColumn="0" w:lastRowLastColumn="0"/>
-            </w:pPr>
             <w:r>
               <w:t>Good For</w:t>
             </w:r>
@@ -904,18 +788,13 @@
         </w:tc>
       </w:tr>
       <w:tr>
-        <w:trPr>
-          <w:cnfStyle w:val="000000100000" w:firstRow="0" w:lastRow="0" w:firstColumn="0" w:lastColumn="0" w:oddVBand="0" w:evenVBand="0" w:oddHBand="1" w:evenHBand="0" w:firstRowFirstColumn="0" w:firstRowLastColumn="0" w:lastRowFirstColumn="0" w:lastRowLastColumn="0"/>
-          <w:jc w:val="center"/>
-        </w:trPr>
         <w:tc>
           <w:tcPr>
-            <w:cnfStyle w:val="001000000000" w:firstRow="0" w:lastRow="0" w:firstColumn="1" w:lastColumn="0" w:oddVBand="0" w:evenVBand="0" w:oddHBand="0" w:evenHBand="0" w:firstRowFirstColumn="0" w:firstRowLastColumn="0" w:lastRowFirstColumn="0" w:lastRowLastColumn="0"/>
             <w:tcW w:w="2160" w:type="dxa"/>
           </w:tcPr>
           <w:p>
             <w:r>
-              <w:t>JavaScript</w:t>
+              <w:t>**JavaScript**</w:t>
             </w:r>
           </w:p>
         </w:tc>
@@ -924,9 +803,6 @@
             <w:tcW w:w="2160" w:type="dxa"/>
           </w:tcPr>
           <w:p>
-            <w:pPr>
-              <w:cnfStyle w:val="000000100000" w:firstRow="0" w:lastRow="0" w:firstColumn="0" w:lastColumn="0" w:oddVBand="0" w:evenVBand="0" w:oddHBand="1" w:evenHBand="0" w:firstRowFirstColumn="0" w:firstRowLastColumn="0" w:lastRowFirstColumn="0" w:lastRowLastColumn="0"/>
-            </w:pPr>
             <w:r>
               <w:t>React or plain HTML</w:t>
             </w:r>
@@ -937,9 +813,6 @@
             <w:tcW w:w="2160" w:type="dxa"/>
           </w:tcPr>
           <w:p>
-            <w:pPr>
-              <w:cnfStyle w:val="000000100000" w:firstRow="0" w:lastRow="0" w:firstColumn="0" w:lastColumn="0" w:oddVBand="0" w:evenVBand="0" w:oddHBand="1" w:evenHBand="0" w:firstRowFirstColumn="0" w:firstRowLastColumn="0" w:lastRowFirstColumn="0" w:lastRowLastColumn="0"/>
-            </w:pPr>
             <w:r>
               <w:t>Node.js + Express</w:t>
             </w:r>
@@ -950,9 +823,6 @@
             <w:tcW w:w="2160" w:type="dxa"/>
           </w:tcPr>
           <w:p>
-            <w:pPr>
-              <w:cnfStyle w:val="000000100000" w:firstRow="0" w:lastRow="0" w:firstColumn="0" w:lastColumn="0" w:oddVBand="0" w:evenVBand="0" w:oddHBand="1" w:evenHBand="0" w:firstRowFirstColumn="0" w:firstRowLastColumn="0" w:lastRowFirstColumn="0" w:lastRowLastColumn="0"/>
-            </w:pPr>
             <w:r>
               <w:t>JS/TS-comfortable teams</w:t>
             </w:r>
@@ -960,18 +830,13 @@
         </w:tc>
       </w:tr>
       <w:tr>
-        <w:trPr>
-          <w:cnfStyle w:val="000000010000" w:firstRow="0" w:lastRow="0" w:firstColumn="0" w:lastColumn="0" w:oddVBand="0" w:evenVBand="0" w:oddHBand="0" w:evenHBand="1" w:firstRowFirstColumn="0" w:firstRowLastColumn="0" w:lastRowFirstColumn="0" w:lastRowLastColumn="0"/>
-          <w:jc w:val="center"/>
-        </w:trPr>
         <w:tc>
           <w:tcPr>
-            <w:cnfStyle w:val="001000000000" w:firstRow="0" w:lastRow="0" w:firstColumn="1" w:lastColumn="0" w:oddVBand="0" w:evenVBand="0" w:oddHBand="0" w:evenHBand="0" w:firstRowFirstColumn="0" w:firstRowLastColumn="0" w:lastRowFirstColumn="0" w:lastRowLastColumn="0"/>
             <w:tcW w:w="2160" w:type="dxa"/>
           </w:tcPr>
           <w:p>
             <w:r>
-              <w:t>Python</w:t>
+              <w:t>**Python**</w:t>
             </w:r>
           </w:p>
         </w:tc>
@@ -980,9 +845,6 @@
             <w:tcW w:w="2160" w:type="dxa"/>
           </w:tcPr>
           <w:p>
-            <w:pPr>
-              <w:cnfStyle w:val="000000010000" w:firstRow="0" w:lastRow="0" w:firstColumn="0" w:lastColumn="0" w:oddVBand="0" w:evenVBand="0" w:oddHBand="0" w:evenHBand="1" w:firstRowFirstColumn="0" w:firstRowLastColumn="0" w:lastRowFirstColumn="0" w:lastRowLastColumn="0"/>
-            </w:pPr>
             <w:r>
               <w:t>HTML + Jinja or React</w:t>
             </w:r>
@@ -993,9 +855,6 @@
             <w:tcW w:w="2160" w:type="dxa"/>
           </w:tcPr>
           <w:p>
-            <w:pPr>
-              <w:cnfStyle w:val="000000010000" w:firstRow="0" w:lastRow="0" w:firstColumn="0" w:lastColumn="0" w:oddVBand="0" w:evenVBand="0" w:oddHBand="0" w:evenHBand="1" w:firstRowFirstColumn="0" w:firstRowLastColumn="0" w:lastRowFirstColumn="0" w:lastRowLastColumn="0"/>
-            </w:pPr>
             <w:r>
               <w:t>Flask / FastAPI</w:t>
             </w:r>
@@ -1006,9 +865,6 @@
             <w:tcW w:w="2160" w:type="dxa"/>
           </w:tcPr>
           <w:p>
-            <w:pPr>
-              <w:cnfStyle w:val="000000010000" w:firstRow="0" w:lastRow="0" w:firstColumn="0" w:lastColumn="0" w:oddVBand="0" w:evenVBand="0" w:oddHBand="0" w:evenHBand="1" w:firstRowFirstColumn="0" w:firstRowLastColumn="0" w:lastRowFirstColumn="0" w:lastRowLastColumn="0"/>
-            </w:pPr>
             <w:r>
               <w:t>Data/ML-leaning teams</w:t>
             </w:r>
@@ -1016,18 +872,13 @@
         </w:tc>
       </w:tr>
       <w:tr>
-        <w:trPr>
-          <w:cnfStyle w:val="000000100000" w:firstRow="0" w:lastRow="0" w:firstColumn="0" w:lastColumn="0" w:oddVBand="0" w:evenVBand="0" w:oddHBand="1" w:evenHBand="0" w:firstRowFirstColumn="0" w:firstRowLastColumn="0" w:lastRowFirstColumn="0" w:lastRowLastColumn="0"/>
-          <w:jc w:val="center"/>
-        </w:trPr>
         <w:tc>
           <w:tcPr>
-            <w:cnfStyle w:val="001000000000" w:firstRow="0" w:lastRow="0" w:firstColumn="1" w:lastColumn="0" w:oddVBand="0" w:evenVBand="0" w:oddHBand="0" w:evenHBand="0" w:firstRowFirstColumn="0" w:firstRowLastColumn="0" w:lastRowFirstColumn="0" w:lastRowLastColumn="0"/>
             <w:tcW w:w="2160" w:type="dxa"/>
           </w:tcPr>
           <w:p>
             <w:r>
-              <w:t>Java</w:t>
+              <w:t>**Java**</w:t>
             </w:r>
           </w:p>
         </w:tc>
@@ -1036,9 +887,6 @@
             <w:tcW w:w="2160" w:type="dxa"/>
           </w:tcPr>
           <w:p>
-            <w:pPr>
-              <w:cnfStyle w:val="000000100000" w:firstRow="0" w:lastRow="0" w:firstColumn="0" w:lastColumn="0" w:oddVBand="0" w:evenVBand="0" w:oddHBand="1" w:evenHBand="0" w:firstRowFirstColumn="0" w:firstRowLastColumn="0" w:lastRowFirstColumn="0" w:lastRowLastColumn="0"/>
-            </w:pPr>
             <w:r>
               <w:t>Thymeleaf or React</w:t>
             </w:r>
@@ -1049,9 +897,6 @@
             <w:tcW w:w="2160" w:type="dxa"/>
           </w:tcPr>
           <w:p>
-            <w:pPr>
-              <w:cnfStyle w:val="000000100000" w:firstRow="0" w:lastRow="0" w:firstColumn="0" w:lastColumn="0" w:oddVBand="0" w:evenVBand="0" w:oddHBand="1" w:evenHBand="0" w:firstRowFirstColumn="0" w:firstRowLastColumn="0" w:lastRowFirstColumn="0" w:lastRowLastColumn="0"/>
-            </w:pPr>
             <w:r>
               <w:t>Spring Boot</w:t>
             </w:r>
@@ -1062,9 +907,6 @@
             <w:tcW w:w="2160" w:type="dxa"/>
           </w:tcPr>
           <w:p>
-            <w:pPr>
-              <w:cnfStyle w:val="000000100000" w:firstRow="0" w:lastRow="0" w:firstColumn="0" w:lastColumn="0" w:oddVBand="0" w:evenVBand="0" w:oddHBand="1" w:evenHBand="0" w:firstRowFirstColumn="0" w:firstRowLastColumn="0" w:lastRowFirstColumn="0" w:lastRowLastColumn="0"/>
-            </w:pPr>
             <w:r>
               <w:t>Java teams</w:t>
             </w:r>
@@ -1072,18 +914,13 @@
         </w:tc>
       </w:tr>
       <w:tr>
-        <w:trPr>
-          <w:cnfStyle w:val="000000010000" w:firstRow="0" w:lastRow="0" w:firstColumn="0" w:lastColumn="0" w:oddVBand="0" w:evenVBand="0" w:oddHBand="0" w:evenHBand="1" w:firstRowFirstColumn="0" w:firstRowLastColumn="0" w:lastRowFirstColumn="0" w:lastRowLastColumn="0"/>
-          <w:jc w:val="center"/>
-        </w:trPr>
         <w:tc>
           <w:tcPr>
-            <w:cnfStyle w:val="001000000000" w:firstRow="0" w:lastRow="0" w:firstColumn="1" w:lastColumn="0" w:oddVBand="0" w:evenVBand="0" w:oddHBand="0" w:evenHBand="0" w:firstRowFirstColumn="0" w:firstRowLastColumn="0" w:lastRowFirstColumn="0" w:lastRowLastColumn="0"/>
             <w:tcW w:w="2160" w:type="dxa"/>
           </w:tcPr>
           <w:p>
             <w:r>
-              <w:t>.NET</w:t>
+              <w:t>**.NET**</w:t>
             </w:r>
           </w:p>
         </w:tc>
@@ -1092,9 +929,6 @@
             <w:tcW w:w="2160" w:type="dxa"/>
           </w:tcPr>
           <w:p>
-            <w:pPr>
-              <w:cnfStyle w:val="000000010000" w:firstRow="0" w:lastRow="0" w:firstColumn="0" w:lastColumn="0" w:oddVBand="0" w:evenVBand="0" w:oddHBand="0" w:evenHBand="1" w:firstRowFirstColumn="0" w:firstRowLastColumn="0" w:lastRowFirstColumn="0" w:lastRowLastColumn="0"/>
-            </w:pPr>
             <w:r>
               <w:t>Blazor or Razor Pages</w:t>
             </w:r>
@@ -1105,9 +939,6 @@
             <w:tcW w:w="2160" w:type="dxa"/>
           </w:tcPr>
           <w:p>
-            <w:pPr>
-              <w:cnfStyle w:val="000000010000" w:firstRow="0" w:lastRow="0" w:firstColumn="0" w:lastColumn="0" w:oddVBand="0" w:evenVBand="0" w:oddHBand="0" w:evenHBand="1" w:firstRowFirstColumn="0" w:firstRowLastColumn="0" w:lastRowFirstColumn="0" w:lastRowLastColumn="0"/>
-            </w:pPr>
             <w:r>
               <w:t>ASP.NET Core Web API</w:t>
             </w:r>
@@ -1118,9 +949,6 @@
             <w:tcW w:w="2160" w:type="dxa"/>
           </w:tcPr>
           <w:p>
-            <w:pPr>
-              <w:cnfStyle w:val="000000010000" w:firstRow="0" w:lastRow="0" w:firstColumn="0" w:lastColumn="0" w:oddVBand="0" w:evenVBand="0" w:oddHBand="0" w:evenHBand="1" w:firstRowFirstColumn="0" w:firstRowLastColumn="0" w:lastRowFirstColumn="0" w:lastRowLastColumn="0"/>
-            </w:pPr>
             <w:r>
               <w:t>.NET teams</w:t>
             </w:r>
@@ -1133,15 +961,18 @@
         <w:pStyle w:val="Heading1"/>
       </w:pPr>
       <w:r>
-        <w:t>What Success Looks Like</w:t>
+        <w:rPr>
+          <w:rFonts w:ascii="Segoe UI Emoji" w:hAnsi="Segoe UI Emoji" w:cs="Segoe UI Emoji"/>
+        </w:rPr>
+        <w:t>✅</w:t>
+      </w:r>
+      <w:r>
+        <w:t xml:space="preserve"> Scope Guidance</w:t>
       </w:r>
     </w:p>
     <w:p>
-      <w:pPr>
-        <w:pStyle w:val="ListBullet"/>
-      </w:pPr>
       <w:r>
-        <w:t>A working application (frontend + API) running locally</w:t>
+        <w:t>To ensure success within the session:</w:t>
       </w:r>
     </w:p>
     <w:p>
@@ -1149,7 +980,7 @@
         <w:pStyle w:val="ListBullet"/>
       </w:pPr>
       <w:r>
-        <w:t>Clear demonstration of Copilot-assisted development during the presentation</w:t>
+        <w:t>**Use Copilot throughout** — the point is the experience, not just the output</w:t>
       </w:r>
     </w:p>
     <w:p>
@@ -1157,7 +988,7 @@
         <w:pStyle w:val="ListBullet"/>
       </w:pPr>
       <w:r>
-        <w:t>A practical, business-relevant validation scenario</w:t>
+        <w:t>**Focus on one document type / use case** — don't try to do everything</w:t>
       </w:r>
     </w:p>
     <w:p>
@@ -1165,20 +996,80 @@
         <w:pStyle w:val="ListBullet"/>
       </w:pPr>
       <w:r>
-        <w:t>A creative approach and thoughtful user experience</w:t>
+        <w:t>**Prioritize a working solution over complexity** — a simple app that works beats a complex one that doesn't</w:t>
       </w:r>
     </w:p>
     <w:p>
       <w:pPr>
+        <w:pStyle w:val="Heading1"/>
+      </w:pPr>
+      <w:r>
+        <w:rPr>
+          <w:rFonts w:ascii="Segoe UI Emoji" w:hAnsi="Segoe UI Emoji" w:cs="Segoe UI Emoji"/>
+        </w:rPr>
+        <w:t>🎉</w:t>
+      </w:r>
+      <w:r>
+        <w:t xml:space="preserve"> What Success Looks Like</w:t>
+      </w:r>
+    </w:p>
+    <w:p>
+      <w:pPr>
         <w:pStyle w:val="ListBullet"/>
       </w:pPr>
       <w:r>
-        <w:t>A team that learned something new about AI-assisted development</w:t>
+        <w:rPr>
+          <w:rFonts w:ascii="Segoe UI Emoji" w:hAnsi="Segoe UI Emoji" w:cs="Segoe UI Emoji"/>
+        </w:rPr>
+        <w:t>✅</w:t>
+      </w:r>
+      <w:r>
+        <w:t xml:space="preserve"> A working application (frontend + API) running locally</w:t>
+      </w:r>
+    </w:p>
+    <w:p>
+      <w:pPr>
+        <w:pStyle w:val="ListBullet"/>
+      </w:pPr>
+      <w:r>
+        <w:t>✅ Three meaningful Playwright test scenarios: happy path, negative path, and one deeper scenario</w:t>
+      </w:r>
+    </w:p>
+    <w:p>
+      <w:pPr>
+        <w:pStyle w:val="ListBullet"/>
+      </w:pPr>
+      <w:r>
+        <w:t>✅ Clear demonstration of Copilot-assisted development during the presentation</w:t>
+      </w:r>
+    </w:p>
+    <w:p>
+      <w:pPr>
+        <w:pStyle w:val="ListBullet"/>
+      </w:pPr>
+      <w:r>
+        <w:t>✅ Evidence that the team used Copilot to generate, refine, and debug Playwright tests</w:t>
+      </w:r>
+    </w:p>
+    <w:p>
+      <w:pPr>
+        <w:pStyle w:val="ListBullet"/>
+      </w:pPr>
+      <w:r>
+        <w:t>✅ A practical, business-relevant validation scenario</w:t>
+      </w:r>
+    </w:p>
+    <w:p>
+      <w:pPr>
+        <w:pStyle w:val="ListBullet"/>
+      </w:pPr>
+      <w:r>
+        <w:t>✅ A team that learned something new about AI-assisted development</w:t>
       </w:r>
     </w:p>
     <w:sectPr>
       <w:pgSz w:w="12240" w:h="15840"/>
-      <w:pgMar w:top="1440" w:right="1800" w:bottom="1440" w:left="1800" w:header="720" w:footer="720" w:gutter="0"/>
+      <w:pgMar w:top="1080" w:right="1080" w:bottom="1080" w:left="1080" w:header="720" w:footer="720" w:gutter="0"/>
       <w:cols w:space="720"/>
       <w:docGrid w:linePitch="360"/>
     </w:sectPr>
@@ -1359,31 +1250,31 @@
       </w:rPr>
     </w:lvl>
   </w:abstractNum>
-  <w:num w:numId="1" w16cid:durableId="179324492">
+  <w:num w:numId="1" w16cid:durableId="1221474321">
     <w:abstractNumId w:val="8"/>
   </w:num>
-  <w:num w:numId="2" w16cid:durableId="431121725">
+  <w:num w:numId="2" w16cid:durableId="1513911454">
     <w:abstractNumId w:val="6"/>
   </w:num>
-  <w:num w:numId="3" w16cid:durableId="1716125843">
+  <w:num w:numId="3" w16cid:durableId="1540430668">
     <w:abstractNumId w:val="5"/>
   </w:num>
-  <w:num w:numId="4" w16cid:durableId="1017658953">
+  <w:num w:numId="4" w16cid:durableId="282808075">
     <w:abstractNumId w:val="4"/>
   </w:num>
-  <w:num w:numId="5" w16cid:durableId="1824733037">
+  <w:num w:numId="5" w16cid:durableId="1660420801">
     <w:abstractNumId w:val="7"/>
   </w:num>
-  <w:num w:numId="6" w16cid:durableId="939097853">
+  <w:num w:numId="6" w16cid:durableId="1961259487">
     <w:abstractNumId w:val="3"/>
   </w:num>
-  <w:num w:numId="7" w16cid:durableId="1732849440">
+  <w:num w:numId="7" w16cid:durableId="741752552">
     <w:abstractNumId w:val="2"/>
   </w:num>
-  <w:num w:numId="8" w16cid:durableId="633411058">
+  <w:num w:numId="8" w16cid:durableId="2012298327">
     <w:abstractNumId w:val="1"/>
   </w:num>
-  <w:num w:numId="9" w16cid:durableId="1936132258">
+  <w:num w:numId="9" w16cid:durableId="1958175545">
     <w:abstractNumId w:val="0"/>
   </w:num>
 </w:numbering>

</xml_diff>